<commit_message>
Shorten main.R to 276 lines, remove unnecessary comments; 5-PS work preserved
</commit_message>
<xml_diff>
--- a/R_Unit1_to_Unit4_Project/report/Supermarket_Sales_FA2_Report.docx
+++ b/R_Unit1_to_Unit4_Project/report/Supermarket_Sales_FA2_Report.docx
@@ -48,7 +48,7 @@
       <w:r>
         <w:drawing>
           <wp:inline distT="0" distB="0" distL="0" distR="0">
-            <wp:extent cx="1280160" cy="1086889"/>
+            <wp:extent cx="1280160" cy="778011"/>
             <wp:docPr id="1" name="img1"/>
             <wp:cNvGraphicFramePr>
               <a:graphicFrameLocks locked="1"/>
@@ -69,7 +69,7 @@
                   <pic:spPr>
                     <a:xfrm>
                       <a:off x="0" y="0"/>
-                      <a:ext cx="1280160" cy="1086889"/>
+                      <a:ext cx="1280160" cy="778011"/>
                     </a:xfrm>
                     <a:prstGeom prst="rect">
                       <a:avLst/>

</xml_diff>